<commit_message>
Implementacion de mejoras: proveedores, alertas del dashboard, comprobante de POS e historial de ventas
</commit_message>
<xml_diff>
--- a/ANALISIS.docx
+++ b/ANALISIS.docx
@@ -198,14 +198,13 @@
           <w:lang w:eastAsia="es-PE"/>
         </w:rPr>
       </w:pPr>
-      <w:proofErr w:type="gramStart"/>
       <w:r>
         <w:rPr>
           <w:b/>
           <w:bCs/>
           <w:lang w:eastAsia="es-PE"/>
         </w:rPr>
-        <w:t xml:space="preserve">LABORATORIO </w:t>
+        <w:t>CURSO</w:t>
       </w:r>
       <w:r>
         <w:rPr>
@@ -213,9 +212,9 @@
           <w:bCs/>
           <w:lang w:eastAsia="es-PE"/>
         </w:rPr>
+        <w:tab/>
         <w:t>:</w:t>
       </w:r>
-      <w:proofErr w:type="gramEnd"/>
       <w:r>
         <w:rPr>
           <w:b/>
@@ -1379,13 +1378,7 @@
               </w:rPr>
             </w:pPr>
             <w:r>
-              <w:t>El sistema debe permitir a</w:t>
-            </w:r>
-            <w:r>
-              <w:t>dministrador</w:t>
-            </w:r>
-            <w:r>
-              <w:t xml:space="preserve"> agregar, editar y eliminar productos, capturando datos como nombre, categoría, costo, y stock.</w:t>
+              <w:t>El sistema debe permitir al usuario agregar, editar y eliminar productos, capturando datos como nombre, descripción, categoría, precio de costo, precio de venta y stock inicial.</w:t>
             </w:r>
           </w:p>
         </w:tc>
@@ -11781,35 +11774,6 @@
             </a:graphic>
           </wp:inline>
         </w:drawing>
-      </w:r>
-    </w:p>
-    <w:p>
-      <w:pPr>
-        <w:ind w:left="-709" w:firstLine="0"/>
-        <w:rPr>
-          <w:u w:val="single"/>
-          <w:lang w:val="es-ES"/>
-        </w:rPr>
-      </w:pPr>
-      <w:r>
-        <w:rPr>
-          <w:lang w:val="es-ES"/>
-        </w:rPr>
-        <w:t>Repositorio:</w:t>
-      </w:r>
-      <w:r>
-        <w:rPr>
-          <w:u w:val="single"/>
-          <w:lang w:val="es-ES"/>
-        </w:rPr>
-        <w:br/>
-      </w:r>
-      <w:r>
-        <w:rPr>
-          <w:u w:val="single"/>
-          <w:lang w:val="es-ES"/>
-        </w:rPr>
-        <w:t>https://github.com/gabito029/SistemaMinimarket.git</w:t>
       </w:r>
     </w:p>
     <w:sectPr>

</xml_diff>